<commit_message>
화면 산출물 파일명 규칙 표준화: ui.md / wireframe.html / mock-data.js
- /ui·/deploy 커맨드, CLAUDE.md, dist 공통 템플릿·index·메뉴 링크를 새 이름으로 갱신
- mdct01·mdpr01·stdc01 산출물 파일명 변경
- WMS 문서 저장소 가이드(docx)도 동일하게 반영
</commit_message>
<xml_diff>
--- a/DEV_DOC/WMS_doc_저장소_가이드.docx
+++ b/DEV_DOC/WMS_doc_저장소_가이드.docx
@@ -1210,7 +1210,7 @@
                 <w:sz w:val="22"/>
                 <w:szCs w:val="22"/>
               </w:rPr>
-              <w:t xml:space="preserve">{메뉴코드}.md(입력), .html(산출), -data.js(산출)</w:t>
+              <w:t xml:space="preserve">ui.md(입력), wireframe.html(산출), mock-data.js(산출)</w:t>
             </w:r>
           </w:p>
         </w:tc>
@@ -1797,7 +1797,7 @@
                 <w:sz w:val="20"/>
                 <w:szCs w:val="20"/>
               </w:rPr>
-              <w:t xml:space="preserve">        ├── {메뉴코드}.md             화면요건정리 문서 (입력)</w:t>
+              <w:t xml:space="preserve">        ├── ui.md                    화면요건정리 문서 (입력)</w:t>
             </w:r>
           </w:p>
           <w:p>
@@ -1810,7 +1810,7 @@
                 <w:sz w:val="20"/>
                 <w:szCs w:val="20"/>
               </w:rPr>
-              <w:t xml:space="preserve">        ├── {메뉴코드}.html           프로토타입 HTML (산출)</w:t>
+              <w:t xml:space="preserve">        ├── wireframe.html            프로토타입 HTML (산출)</w:t>
             </w:r>
           </w:p>
           <w:p>
@@ -1823,7 +1823,7 @@
                 <w:sz w:val="20"/>
                 <w:szCs w:val="20"/>
               </w:rPr>
-              <w:t xml:space="preserve">        └── {메뉴코드}-data.js        테스트 데이터 JS (산출)</w:t>
+              <w:t xml:space="preserve">        └── mock-data.js              테스트 데이터 JS (산출)</w:t>
             </w:r>
           </w:p>
         </w:tc>
@@ -2660,7 +2660,7 @@
                 <w:sz w:val="22"/>
                 <w:szCs w:val="22"/>
               </w:rPr>
-              <w:t xml:space="preserve">dist/{메뉴코드}/*.md</w:t>
+              <w:t xml:space="preserve">dist/{메뉴코드}/ui.md</w:t>
             </w:r>
           </w:p>
         </w:tc>
@@ -2910,7 +2910,7 @@
                 <w:sz w:val="22"/>
                 <w:szCs w:val="22"/>
               </w:rPr>
-              <w:t xml:space="preserve">.claude/commands/, dist/common/_template/, dist/{메뉴코드}/*.md 는 특정 메뉴를 작업할 때만 필요한 대용량 자료이므로, 슬래시 커맨드 실행 또는 명시적 Read 시에만 로드해 컨텍스트 윈도우를 아낀다.</w:t>
+              <w:t xml:space="preserve">.claude/commands/, dist/common/_template/, dist/{메뉴코드}/ui.md 는 특정 메뉴를 작업할 때만 필요한 대용량 자료이므로, 슬래시 커맨드 실행 또는 명시적 Read 시에만 로드해 컨텍스트 윈도우를 아낀다.</w:t>
             </w:r>
           </w:p>
         </w:tc>
@@ -3486,7 +3486,7 @@
                 <w:sz w:val="22"/>
                 <w:szCs w:val="22"/>
               </w:rPr>
-              <w:t xml:space="preserve">dist/{메뉴코드}/{메뉴코드}.md 명세</w:t>
+              <w:t xml:space="preserve">dist/{메뉴코드}/ui.md 명세</w:t>
             </w:r>
           </w:p>
         </w:tc>
@@ -4212,7 +4212,7 @@
                 <w:sz w:val="22"/>
                 <w:szCs w:val="22"/>
               </w:rPr>
-              <w:t xml:space="preserve">dist/{메뉴코드}/{메뉴코드}.md → .html + -data.js</w:t>
+              <w:t xml:space="preserve">dist/{메뉴코드}/ui.md → wireframe.html + mock-data.js</w:t>
             </w:r>
           </w:p>
         </w:tc>
@@ -5333,7 +5333,7 @@
                 <w:sz w:val="20"/>
                 <w:szCs w:val="20"/>
               </w:rPr>
-              <w:t xml:space="preserve">dist/{메뉴코드}/{메뉴코드}.md  (화면요건)</w:t>
+              <w:t xml:space="preserve">dist/{메뉴코드}/ui.md  (화면요건)</w:t>
             </w:r>
           </w:p>
           <w:p>
@@ -5515,7 +5515,7 @@
                 <w:sz w:val="20"/>
                 <w:szCs w:val="20"/>
               </w:rPr>
-              <w:t xml:space="preserve">dist/{메뉴코드}/{메뉴코드}.html  (산출물)</w:t>
+              <w:t xml:space="preserve">dist/{메뉴코드}/wireframe.html  (산출물)</w:t>
             </w:r>
           </w:p>
         </w:tc>
@@ -5565,7 +5565,7 @@
           <w:sz w:val="22"/>
           <w:szCs w:val="22"/>
         </w:rPr>
-        <w:t xml:space="preserve">dist/{메뉴코드}/{메뉴코드}.md 를 읽어 공통 CSS·JS + UI유형별 스켈레톤을 조합해 프로토타입 HTML과 테스트 데이터 JS를 생성한다.</w:t>
+        <w:t xml:space="preserve">dist/{메뉴코드}/ui.md 를 읽어 공통 CSS·JS + UI유형별 스켈레톤을 조합해 프로토타입 HTML과 테스트 데이터 JS를 생성한다.</w:t>
       </w:r>
     </w:p>
     <w:tbl>
@@ -5708,7 +5708,7 @@
                 <w:sz w:val="22"/>
                 <w:szCs w:val="22"/>
               </w:rPr>
-              <w:t xml:space="preserve">{메뉴코드}.md, icon-preview.html, base.html, UI유형별 gridX-*.html 1종</w:t>
+              <w:t xml:space="preserve">ui.md, icon-preview.html, base.html, UI유형별 gridX-*.html 1종</w:t>
             </w:r>
           </w:p>
         </w:tc>
@@ -5832,7 +5832,7 @@
                 <w:sz w:val="22"/>
                 <w:szCs w:val="22"/>
               </w:rPr>
-              <w:t xml:space="preserve">{메뉴코드}-data.js (메인 10건 이상, 디테일 5건 이상)</w:t>
+              <w:t xml:space="preserve">mock-data.js (메인 10건 이상, 디테일 5건 이상)</w:t>
             </w:r>
           </w:p>
         </w:tc>
@@ -6337,7 +6337,7 @@
                 <w:sz w:val="22"/>
                 <w:szCs w:val="22"/>
               </w:rPr>
-              <w:t xml:space="preserve">index.html + common/{left-menu·wms-ui.css·wms-common.js} + {메뉴코드}/{.html·-data.js·.md} 업로드</w:t>
+              <w:t xml:space="preserve">index.html + common/{left-menu·wms-ui.css·wms-common.js} + {메뉴코드}/{wireframe.html·mock-data.js·ui.md} 업로드</w:t>
             </w:r>
           </w:p>
         </w:tc>
@@ -7517,7 +7517,7 @@
                 <w:sz w:val="22"/>
                 <w:szCs w:val="22"/>
               </w:rPr>
-              <w:t xml:space="preserve">{메뉴코드}.md</w:t>
+              <w:t xml:space="preserve">ui.md</w:t>
             </w:r>
           </w:p>
         </w:tc>
@@ -7609,7 +7609,7 @@
                 <w:sz w:val="22"/>
                 <w:szCs w:val="22"/>
               </w:rPr>
-              <w:t xml:space="preserve">{메뉴코드}.html</w:t>
+              <w:t xml:space="preserve">wireframe.html</w:t>
             </w:r>
           </w:p>
         </w:tc>
@@ -7701,7 +7701,7 @@
                 <w:sz w:val="22"/>
                 <w:szCs w:val="22"/>
               </w:rPr>
-              <w:t xml:space="preserve">{메뉴코드}-data.js</w:t>
+              <w:t xml:space="preserve">mock-data.js</w:t>
             </w:r>
           </w:p>
         </w:tc>
@@ -7866,7 +7866,7 @@
                 <w:sz w:val="20"/>
                 <w:szCs w:val="20"/>
               </w:rPr>
-              <w:t xml:space="preserve">{메뉴코드}.html   →   window.parent.postMessage({ type: 'OPEN_CP_LAYER' })</w:t>
+              <w:t xml:space="preserve">wireframe.html    →   window.parent.postMessage({ type: 'OPEN_CP_LAYER' })</w:t>
             </w:r>
           </w:p>
           <w:p>
@@ -7905,7 +7905,7 @@
                 <w:sz w:val="20"/>
                 <w:szCs w:val="20"/>
               </w:rPr>
-              <w:t xml:space="preserve">index.html        →   {메뉴코드}.html 로 결과 전달</w:t>
+              <w:t xml:space="preserve">index.html        →   wireframe.html 로 결과 전달</w:t>
             </w:r>
           </w:p>
         </w:tc>
@@ -8389,7 +8389,7 @@
                 <w:sz w:val="20"/>
                 <w:szCs w:val="20"/>
               </w:rPr>
-              <w:t xml:space="preserve">② 요건 문서 작성            → dist/{메뉴코드}/{메뉴코드}.md</w:t>
+              <w:t xml:space="preserve">② 요건 문서 작성            → dist/{메뉴코드}/ui.md</w:t>
             </w:r>
           </w:p>
           <w:p>
@@ -8428,7 +8428,7 @@
                 <w:sz w:val="20"/>
                 <w:szCs w:val="20"/>
               </w:rPr>
-              <w:t xml:space="preserve">③ /ui {메뉴코드}            → {메뉴코드}.html + {메뉴코드}-data.js 생성</w:t>
+              <w:t xml:space="preserve">③ /ui {메뉴코드}            → wireframe.html + mock-data.js 생성</w:t>
             </w:r>
           </w:p>
           <w:p>
@@ -10475,7 +10475,7 @@
                 <w:sz w:val="22"/>
                 <w:szCs w:val="22"/>
               </w:rPr>
-              <w:t xml:space="preserve">{메뉴코드}-data.js 파일로 분리하고 &lt;script src&gt; 로 로드한다. fetch + .json 은 file:// 에서 CORS 오류가 나므로 금지. 메인 10건·디테일 5건 이상.</w:t>
+              <w:t xml:space="preserve">mock-data.js 파일로 분리하고 &lt;script src&gt; 로 로드한다. fetch + .json 은 file:// 에서 CORS 오류가 나므로 금지. 메인 10건·디테일 5건 이상.</w:t>
             </w:r>
           </w:p>
         </w:tc>
@@ -10720,7 +10720,7 @@
           <w:sz w:val="22"/>
           <w:szCs w:val="22"/>
         </w:rPr>
-        <w:t xml:space="preserve">requirements/요구사항내역서.xlsx 를 xlsx 스킬로 읽어 메뉴코드별 행을 dist/{메뉴코드}/{메뉴코드}.md 초안(메뉴그룹·UI유형·검색 영역·그리드 컬럼 목록)으로 자동 변환하는 /spec-init {메뉴코드} 커맨드 추가.</w:t>
+        <w:t xml:space="preserve">requirements/요구사항내역서.xlsx 를 xlsx 스킬로 읽어 메뉴코드별 행을 dist/{메뉴코드}/ui.md 초안(메뉴그룹·UI유형·검색 영역·그리드 컬럼 목록)으로 자동 변환하는 /spec-init {메뉴코드} 커맨드 추가.</w:t>
       </w:r>
     </w:p>
     <w:p>

</xml_diff>